<commit_message>
Update Devika Yanamala CV to match senior's two-line header alignment format
</commit_message>
<xml_diff>
--- a/Devika_Yanamala_CV.docx
+++ b/Devika_Yanamala_CV.docx
@@ -12,7 +12,7 @@
           <w:rFonts w:ascii="Times New Roman" w:hAnsi="Times New Roman"/>
           <w:b/>
           <w:color w:val="000000"/>
-          <w:sz w:val="28"/>
+          <w:sz w:val="30"/>
         </w:rPr>
         <w:t>DEVIKA YANAMALA</w:t>
       </w:r>
@@ -28,7 +28,7 @@
           <w:color w:val="000000"/>
           <w:sz w:val="18"/>
         </w:rPr>
-        <w:t xml:space="preserve">Newcastle, UK  |  Open to Relocation  |  devikayanamala55@gmail.com  |  +44 7352683914  |  </w:t>
+        <w:t xml:space="preserve">Newcastle, UK  |  +44 7352683914  |  devikayanamala55@gmail.com  |  </w:t>
       </w:r>
       <w:hyperlink r:id="rId9">
         <w:r>
@@ -73,9 +73,9 @@
           <w:rFonts w:ascii="Times New Roman" w:hAnsi="Times New Roman"/>
           <w:b/>
           <w:color w:val="000000"/>
-          <w:sz w:val="20"/>
+          <w:sz w:val="21"/>
         </w:rPr>
-        <w:t>PROFESSIONAL SUMMARY</w:t>
+        <w:t>Professional Summary</w:t>
       </w:r>
     </w:p>
     <w:p>
@@ -105,9 +105,9 @@
           <w:rFonts w:ascii="Times New Roman" w:hAnsi="Times New Roman"/>
           <w:b/>
           <w:color w:val="000000"/>
-          <w:sz w:val="20"/>
+          <w:sz w:val="21"/>
         </w:rPr>
-        <w:t>TECHNICAL SKILLS</w:t>
+        <w:t>Technical Expertise</w:t>
       </w:r>
     </w:p>
     <w:p>
@@ -254,9 +254,9 @@
           <w:rFonts w:ascii="Times New Roman" w:hAnsi="Times New Roman"/>
           <w:b/>
           <w:color w:val="000000"/>
-          <w:sz w:val="20"/>
+          <w:sz w:val="21"/>
         </w:rPr>
-        <w:t>PROFESSIONAL EXPERIENCE</w:t>
+        <w:t>Professional Experience</w:t>
       </w:r>
     </w:p>
     <w:p>
@@ -264,16 +264,45 @@
         <w:tabs>
           <w:tab w:pos="10800" w:val="right"/>
         </w:tabs>
-        <w:spacing w:before="80" w:after="20"/>
+        <w:spacing w:before="80" w:after="0"/>
       </w:pPr>
       <w:r>
         <w:rPr>
           <w:rFonts w:ascii="Times New Roman" w:hAnsi="Times New Roman"/>
           <w:b/>
           <w:color w:val="000000"/>
+          <w:sz w:val="19"/>
+        </w:rPr>
+        <w:t>Global Industry Project – Industry Consulting Experience</w:t>
+      </w:r>
+      <w:r>
+        <w:tab/>
+      </w:r>
+      <w:r>
+        <w:rPr>
+          <w:rFonts w:ascii="Times New Roman" w:hAnsi="Times New Roman"/>
+          <w:i w:val="0"/>
+          <w:color w:val="000000"/>
+          <w:sz w:val="19"/>
+        </w:rPr>
+        <w:t>June 2026 – July 2026</w:t>
+      </w:r>
+    </w:p>
+    <w:p>
+      <w:pPr>
+        <w:tabs>
+          <w:tab w:pos="10800" w:val="right"/>
+        </w:tabs>
+        <w:spacing w:before="0" w:after="20"/>
+      </w:pPr>
+      <w:r>
+        <w:rPr>
+          <w:rFonts w:ascii="Times New Roman" w:hAnsi="Times New Roman"/>
+          <w:i/>
+          <w:color w:val="000000"/>
           <w:sz w:val="18"/>
         </w:rPr>
-        <w:t>Global Industry Project – Industry Consulting Experience  |  Newcastle University</w:t>
+        <w:t>Newcastle University</w:t>
       </w:r>
       <w:r>
         <w:tab/>
@@ -285,7 +314,7 @@
           <w:color w:val="000000"/>
           <w:sz w:val="18"/>
         </w:rPr>
-        <w:t>June 2026 – July 2026</w:t>
+        <w:t>Industry Partner Project - Newcastle, UK</w:t>
       </w:r>
     </w:p>
     <w:p>
@@ -341,16 +370,45 @@
         <w:tabs>
           <w:tab w:pos="10800" w:val="right"/>
         </w:tabs>
-        <w:spacing w:before="80" w:after="20"/>
+        <w:spacing w:before="80" w:after="0"/>
       </w:pPr>
       <w:r>
         <w:rPr>
           <w:rFonts w:ascii="Times New Roman" w:hAnsi="Times New Roman"/>
           <w:b/>
           <w:color w:val="000000"/>
+          <w:sz w:val="19"/>
+        </w:rPr>
+        <w:t>Data Analyst – Product Analytics</w:t>
+      </w:r>
+      <w:r>
+        <w:tab/>
+      </w:r>
+      <w:r>
+        <w:rPr>
+          <w:rFonts w:ascii="Times New Roman" w:hAnsi="Times New Roman"/>
+          <w:i w:val="0"/>
+          <w:color w:val="000000"/>
+          <w:sz w:val="19"/>
+        </w:rPr>
+        <w:t>04/2026 – Present</w:t>
+      </w:r>
+    </w:p>
+    <w:p>
+      <w:pPr>
+        <w:tabs>
+          <w:tab w:pos="10800" w:val="right"/>
+        </w:tabs>
+        <w:spacing w:before="0" w:after="20"/>
+      </w:pPr>
+      <w:r>
+        <w:rPr>
+          <w:rFonts w:ascii="Times New Roman" w:hAnsi="Times New Roman"/>
+          <w:i/>
+          <w:color w:val="000000"/>
           <w:sz w:val="18"/>
         </w:rPr>
-        <w:t>Data Analyst – Product Analytics  |  Rooted Platform (Independent Project)</w:t>
+        <w:t>Rooted Platform</w:t>
       </w:r>
       <w:r>
         <w:tab/>
@@ -362,7 +420,7 @@
           <w:color w:val="000000"/>
           <w:sz w:val="18"/>
         </w:rPr>
-        <w:t>04/2026 – Present</w:t>
+        <w:t>Independent Project - Remote</w:t>
       </w:r>
     </w:p>
     <w:p>
@@ -418,16 +476,45 @@
         <w:tabs>
           <w:tab w:pos="10800" w:val="right"/>
         </w:tabs>
-        <w:spacing w:before="80" w:after="20"/>
+        <w:spacing w:before="80" w:after="0"/>
       </w:pPr>
       <w:r>
         <w:rPr>
           <w:rFonts w:ascii="Times New Roman" w:hAnsi="Times New Roman"/>
           <w:b/>
           <w:color w:val="000000"/>
+          <w:sz w:val="19"/>
+        </w:rPr>
+        <w:t>Data Analyst (Studentship)</w:t>
+      </w:r>
+      <w:r>
+        <w:tab/>
+      </w:r>
+      <w:r>
+        <w:rPr>
+          <w:rFonts w:ascii="Times New Roman" w:hAnsi="Times New Roman"/>
+          <w:i w:val="0"/>
+          <w:color w:val="000000"/>
+          <w:sz w:val="19"/>
+        </w:rPr>
+        <w:t>01/2026 – Present</w:t>
+      </w:r>
+    </w:p>
+    <w:p>
+      <w:pPr>
+        <w:tabs>
+          <w:tab w:pos="10800" w:val="right"/>
+        </w:tabs>
+        <w:spacing w:before="0" w:after="20"/>
+      </w:pPr>
+      <w:r>
+        <w:rPr>
+          <w:rFonts w:ascii="Times New Roman" w:hAnsi="Times New Roman"/>
+          <w:i/>
+          <w:color w:val="000000"/>
           <w:sz w:val="18"/>
         </w:rPr>
-        <w:t>Data Analyst (Studentship)  |  Newcastle University, UK</w:t>
+        <w:t>Newcastle University</w:t>
       </w:r>
       <w:r>
         <w:tab/>
@@ -439,7 +526,7 @@
           <w:color w:val="000000"/>
           <w:sz w:val="18"/>
         </w:rPr>
-        <w:t>01/2026 – Present</w:t>
+        <w:t>Part-Time Role - Newcastle upon Tyne, UK</w:t>
       </w:r>
     </w:p>
     <w:p>
@@ -495,16 +582,45 @@
         <w:tabs>
           <w:tab w:pos="10800" w:val="right"/>
         </w:tabs>
-        <w:spacing w:before="80" w:after="20"/>
+        <w:spacing w:before="80" w:after="0"/>
       </w:pPr>
       <w:r>
         <w:rPr>
           <w:rFonts w:ascii="Times New Roman" w:hAnsi="Times New Roman"/>
           <w:b/>
           <w:color w:val="000000"/>
+          <w:sz w:val="19"/>
+        </w:rPr>
+        <w:t>Associate Data Scientist</w:t>
+      </w:r>
+      <w:r>
+        <w:tab/>
+      </w:r>
+      <w:r>
+        <w:rPr>
+          <w:rFonts w:ascii="Times New Roman" w:hAnsi="Times New Roman"/>
+          <w:i w:val="0"/>
+          <w:color w:val="000000"/>
+          <w:sz w:val="19"/>
+        </w:rPr>
+        <w:t>05/2023 – 05/2025</w:t>
+      </w:r>
+    </w:p>
+    <w:p>
+      <w:pPr>
+        <w:tabs>
+          <w:tab w:pos="10800" w:val="right"/>
+        </w:tabs>
+        <w:spacing w:before="0" w:after="20"/>
+      </w:pPr>
+      <w:r>
+        <w:rPr>
+          <w:rFonts w:ascii="Times New Roman" w:hAnsi="Times New Roman"/>
+          <w:i/>
+          <w:color w:val="000000"/>
           <w:sz w:val="18"/>
         </w:rPr>
-        <w:t>Associate Data Scientist  |  BEPEC Solutions, Bangalore, India</w:t>
+        <w:t>BEPEC Solutions</w:t>
       </w:r>
       <w:r>
         <w:tab/>
@@ -516,7 +632,7 @@
           <w:color w:val="000000"/>
           <w:sz w:val="18"/>
         </w:rPr>
-        <w:t>05/2023 – 05/2025</w:t>
+        <w:t>Full-Time - Bangalore, India</w:t>
       </w:r>
     </w:p>
     <w:p>
@@ -572,16 +688,45 @@
         <w:tabs>
           <w:tab w:pos="10800" w:val="right"/>
         </w:tabs>
-        <w:spacing w:before="80" w:after="20"/>
+        <w:spacing w:before="80" w:after="0"/>
       </w:pPr>
       <w:r>
         <w:rPr>
           <w:rFonts w:ascii="Times New Roman" w:hAnsi="Times New Roman"/>
           <w:b/>
           <w:color w:val="000000"/>
+          <w:sz w:val="19"/>
+        </w:rPr>
+        <w:t>Data Scientist Intern</w:t>
+      </w:r>
+      <w:r>
+        <w:tab/>
+      </w:r>
+      <w:r>
+        <w:rPr>
+          <w:rFonts w:ascii="Times New Roman" w:hAnsi="Times New Roman"/>
+          <w:i w:val="0"/>
+          <w:color w:val="000000"/>
+          <w:sz w:val="19"/>
+        </w:rPr>
+        <w:t>01/2023 – 05/2023</w:t>
+      </w:r>
+    </w:p>
+    <w:p>
+      <w:pPr>
+        <w:tabs>
+          <w:tab w:pos="10800" w:val="right"/>
+        </w:tabs>
+        <w:spacing w:before="0" w:after="20"/>
+      </w:pPr>
+      <w:r>
+        <w:rPr>
+          <w:rFonts w:ascii="Times New Roman" w:hAnsi="Times New Roman"/>
+          <w:i/>
+          <w:color w:val="000000"/>
           <w:sz w:val="18"/>
         </w:rPr>
-        <w:t>Data Scientist Intern  |  BEPEC Solutions, Bangalore, India</w:t>
+        <w:t>BEPEC Solutions</w:t>
       </w:r>
       <w:r>
         <w:tab/>
@@ -593,7 +738,7 @@
           <w:color w:val="000000"/>
           <w:sz w:val="18"/>
         </w:rPr>
-        <w:t>01/2023 – 05/2023</w:t>
+        <w:t>Internship - Bangalore, India</w:t>
       </w:r>
     </w:p>
     <w:p>
@@ -640,9 +785,9 @@
           <w:rFonts w:ascii="Times New Roman" w:hAnsi="Times New Roman"/>
           <w:b/>
           <w:color w:val="000000"/>
-          <w:sz w:val="20"/>
+          <w:sz w:val="21"/>
         </w:rPr>
-        <w:t>KEY PROJECTS</w:t>
+        <w:t>Selected Projects &amp; Initiatives</w:t>
       </w:r>
     </w:p>
     <w:p>
@@ -657,22 +802,40 @@
           <w:rFonts w:ascii="Times New Roman" w:hAnsi="Times New Roman"/>
           <w:b/>
           <w:color w:val="000000"/>
-          <w:sz w:val="18"/>
+          <w:sz w:val="19"/>
         </w:rPr>
-        <w:t>Commercial Opportunities Analytics Dashboard (Retail)  |  Power BI, DAX, Python</w:t>
+        <w:t>Commercial Opportunities Analytics Dashboard (Retail)</w:t>
       </w:r>
       <w:r>
         <w:tab/>
+      </w:r>
+      <w:r>
+        <w:rPr>
+          <w:rFonts w:ascii="Times New Roman" w:hAnsi="Times New Roman"/>
+          <w:i w:val="0"/>
+          <w:color w:val="000000"/>
+          <w:sz w:val="19"/>
+        </w:rPr>
+        <w:t>Personal Project</w:t>
+      </w:r>
+      <w:r>
+        <w:rPr>
+          <w:rFonts w:ascii="Times New Roman" w:hAnsi="Times New Roman"/>
+          <w:i w:val="0"/>
+          <w:color w:val="000000"/>
+          <w:sz w:val="19"/>
+        </w:rPr>
+        <w:t xml:space="preserve"> | </w:t>
       </w:r>
       <w:hyperlink r:id="rId11">
         <w:r>
           <w:rPr>
             <w:rFonts w:ascii="Times New Roman" w:hAnsi="Times New Roman"/>
-            <w:sz w:val="18"/>
+            <w:sz w:val="19"/>
             <w:color w:val="000000"/>
             <w:u w:val="single"/>
           </w:rPr>
-          <w:t>GitHub Repository</w:t>
+          <w:t>GitHub</w:t>
         </w:r>
       </w:hyperlink>
     </w:p>
@@ -736,22 +899,40 @@
           <w:rFonts w:ascii="Times New Roman" w:hAnsi="Times New Roman"/>
           <w:b/>
           <w:color w:val="000000"/>
-          <w:sz w:val="18"/>
+          <w:sz w:val="19"/>
         </w:rPr>
-        <w:t>Pharmaceutical Marketing Strategy &amp; Attribution Analysis  |  Python, Statsmodels, Power BI</w:t>
+        <w:t>Pharmaceutical Marketing Strategy &amp; Attribution Analysis</w:t>
       </w:r>
       <w:r>
         <w:tab/>
+      </w:r>
+      <w:r>
+        <w:rPr>
+          <w:rFonts w:ascii="Times New Roman" w:hAnsi="Times New Roman"/>
+          <w:i w:val="0"/>
+          <w:color w:val="000000"/>
+          <w:sz w:val="19"/>
+        </w:rPr>
+        <w:t>Personal Project</w:t>
+      </w:r>
+      <w:r>
+        <w:rPr>
+          <w:rFonts w:ascii="Times New Roman" w:hAnsi="Times New Roman"/>
+          <w:i w:val="0"/>
+          <w:color w:val="000000"/>
+          <w:sz w:val="19"/>
+        </w:rPr>
+        <w:t xml:space="preserve"> | </w:t>
       </w:r>
       <w:hyperlink r:id="rId12">
         <w:r>
           <w:rPr>
             <w:rFonts w:ascii="Times New Roman" w:hAnsi="Times New Roman"/>
-            <w:sz w:val="18"/>
+            <w:sz w:val="19"/>
             <w:color w:val="000000"/>
             <w:u w:val="single"/>
           </w:rPr>
-          <w:t>GitHub Repository</w:t>
+          <w:t>GitHub</w:t>
         </w:r>
       </w:hyperlink>
     </w:p>
@@ -815,22 +996,40 @@
           <w:rFonts w:ascii="Times New Roman" w:hAnsi="Times New Roman"/>
           <w:b/>
           <w:color w:val="000000"/>
-          <w:sz w:val="18"/>
+          <w:sz w:val="19"/>
         </w:rPr>
-        <w:t>Next Best Action &amp; Churn Prediction Model (Banking)  |  Python, XGBoost, SHAP</w:t>
+        <w:t>Next Best Action &amp; Churn Prediction Model (Banking)</w:t>
       </w:r>
       <w:r>
         <w:tab/>
+      </w:r>
+      <w:r>
+        <w:rPr>
+          <w:rFonts w:ascii="Times New Roman" w:hAnsi="Times New Roman"/>
+          <w:i w:val="0"/>
+          <w:color w:val="000000"/>
+          <w:sz w:val="19"/>
+        </w:rPr>
+        <w:t>Personal Project</w:t>
+      </w:r>
+      <w:r>
+        <w:rPr>
+          <w:rFonts w:ascii="Times New Roman" w:hAnsi="Times New Roman"/>
+          <w:i w:val="0"/>
+          <w:color w:val="000000"/>
+          <w:sz w:val="19"/>
+        </w:rPr>
+        <w:t xml:space="preserve"> | </w:t>
       </w:r>
       <w:hyperlink r:id="rId13">
         <w:r>
           <w:rPr>
             <w:rFonts w:ascii="Times New Roman" w:hAnsi="Times New Roman"/>
-            <w:sz w:val="18"/>
+            <w:sz w:val="19"/>
             <w:color w:val="000000"/>
             <w:u w:val="single"/>
           </w:rPr>
-          <w:t>GitHub Repository</w:t>
+          <w:t>GitHub</w:t>
         </w:r>
       </w:hyperlink>
     </w:p>
@@ -894,9 +1093,9 @@
           <w:rFonts w:ascii="Times New Roman" w:hAnsi="Times New Roman"/>
           <w:b/>
           <w:color w:val="000000"/>
-          <w:sz w:val="20"/>
+          <w:sz w:val="21"/>
         </w:rPr>
-        <w:t>EDUCATION</w:t>
+        <w:t>Education</w:t>
       </w:r>
     </w:p>
     <w:p>
@@ -904,16 +1103,45 @@
         <w:tabs>
           <w:tab w:pos="10800" w:val="right"/>
         </w:tabs>
-        <w:spacing w:before="80" w:after="20"/>
+        <w:spacing w:before="80" w:after="0"/>
       </w:pPr>
       <w:r>
         <w:rPr>
           <w:rFonts w:ascii="Times New Roman" w:hAnsi="Times New Roman"/>
           <w:b/>
           <w:color w:val="000000"/>
+          <w:sz w:val="19"/>
+        </w:rPr>
+        <w:t>Master of Science (MSc), Data Science &amp; Artificial Intelligence</w:t>
+      </w:r>
+      <w:r>
+        <w:tab/>
+      </w:r>
+      <w:r>
+        <w:rPr>
+          <w:rFonts w:ascii="Times New Roman" w:hAnsi="Times New Roman"/>
+          <w:i w:val="0"/>
+          <w:color w:val="000000"/>
+          <w:sz w:val="19"/>
+        </w:rPr>
+        <w:t>Expected 09/2026</w:t>
+      </w:r>
+    </w:p>
+    <w:p>
+      <w:pPr>
+        <w:tabs>
+          <w:tab w:pos="10800" w:val="right"/>
+        </w:tabs>
+        <w:spacing w:before="0" w:after="20"/>
+      </w:pPr>
+      <w:r>
+        <w:rPr>
+          <w:rFonts w:ascii="Times New Roman" w:hAnsi="Times New Roman"/>
+          <w:i/>
+          <w:color w:val="000000"/>
           <w:sz w:val="18"/>
         </w:rPr>
-        <w:t>Master of Science (MSc), Data Science &amp; Artificial Intelligence  |  Newcastle University, UK</w:t>
+        <w:t>Newcastle University</w:t>
       </w:r>
       <w:r>
         <w:tab/>
@@ -925,7 +1153,7 @@
           <w:color w:val="000000"/>
           <w:sz w:val="18"/>
         </w:rPr>
-        <w:t>Expected 09/2026</w:t>
+        <w:t>Newcastle upon Tyne, UK</w:t>
       </w:r>
     </w:p>
     <w:p>
@@ -941,7 +1169,7 @@
           <w:color w:val="000000"/>
           <w:sz w:val="18"/>
         </w:rPr>
-        <w:t>UK Modules: Data Visualisation, Machine Learning, Statistical Foundations of Data Science, Deep Learning, Image Processing, Generative AI for Business, Advanced AI, Group Project.</w:t>
+        <w:t>UK Coursework: Data Visualisation, Machine Learning, Statistical Foundations of Data Science, Deep Learning, Image Processing, Generative AI for Business, Advanced AI, Group Project.</w:t>
       </w:r>
     </w:p>
     <w:p>
@@ -949,16 +1177,45 @@
         <w:tabs>
           <w:tab w:pos="10800" w:val="right"/>
         </w:tabs>
-        <w:spacing w:before="80" w:after="20"/>
+        <w:spacing w:before="80" w:after="0"/>
       </w:pPr>
       <w:r>
         <w:rPr>
           <w:rFonts w:ascii="Times New Roman" w:hAnsi="Times New Roman"/>
           <w:b/>
           <w:color w:val="000000"/>
+          <w:sz w:val="19"/>
+        </w:rPr>
+        <w:t>Bachelor of Technology</w:t>
+      </w:r>
+      <w:r>
+        <w:tab/>
+      </w:r>
+      <w:r>
+        <w:rPr>
+          <w:rFonts w:ascii="Times New Roman" w:hAnsi="Times New Roman"/>
+          <w:i w:val="0"/>
+          <w:color w:val="000000"/>
+          <w:sz w:val="19"/>
+        </w:rPr>
+        <w:t>2019 – 2023</w:t>
+      </w:r>
+    </w:p>
+    <w:p>
+      <w:pPr>
+        <w:tabs>
+          <w:tab w:pos="10800" w:val="right"/>
+        </w:tabs>
+        <w:spacing w:before="0" w:after="20"/>
+      </w:pPr>
+      <w:r>
+        <w:rPr>
+          <w:rFonts w:ascii="Times New Roman" w:hAnsi="Times New Roman"/>
+          <w:i/>
+          <w:color w:val="000000"/>
           <w:sz w:val="18"/>
         </w:rPr>
-        <w:t>Bachelor of Technology  |  IIIT, RGUKT, RK Valley, India</w:t>
+        <w:t>IIIT, RGUKT</w:t>
       </w:r>
       <w:r>
         <w:tab/>
@@ -970,7 +1227,7 @@
           <w:color w:val="000000"/>
           <w:sz w:val="18"/>
         </w:rPr>
-        <w:t>2019 – 2023</w:t>
+        <w:t>CGPA: 8.7/10 - RK Valley, India</w:t>
       </w:r>
     </w:p>
     <w:p>
@@ -986,7 +1243,7 @@
           <w:color w:val="000000"/>
           <w:sz w:val="18"/>
         </w:rPr>
-        <w:t>CGPA: 8.7/10</w:t>
+        <w:t>Relevant Coursework: Data Structures, Algorithms, Database Management Systems, Machine Learning Foundations.</w:t>
       </w:r>
     </w:p>
     <w:p>
@@ -1001,9 +1258,9 @@
           <w:rFonts w:ascii="Times New Roman" w:hAnsi="Times New Roman"/>
           <w:b/>
           <w:color w:val="000000"/>
-          <w:sz w:val="20"/>
+          <w:sz w:val="21"/>
         </w:rPr>
-        <w:t>CERTIFICATIONS &amp; ACHIEVEMENTS</w:t>
+        <w:t>Professional Certifications</w:t>
       </w:r>
     </w:p>
     <w:p>
@@ -1011,16 +1268,45 @@
         <w:tabs>
           <w:tab w:pos="10800" w:val="right"/>
         </w:tabs>
-        <w:spacing w:before="80" w:after="20"/>
+        <w:spacing w:before="80" w:after="0"/>
       </w:pPr>
       <w:r>
         <w:rPr>
           <w:rFonts w:ascii="Times New Roman" w:hAnsi="Times New Roman"/>
           <w:b/>
           <w:color w:val="000000"/>
+          <w:sz w:val="19"/>
+        </w:rPr>
+        <w:t>UK Work Culture Programme (Awarded Participant)</w:t>
+      </w:r>
+      <w:r>
+        <w:tab/>
+      </w:r>
+      <w:r>
+        <w:rPr>
+          <w:rFonts w:ascii="Times New Roman" w:hAnsi="Times New Roman"/>
+          <w:i w:val="0"/>
+          <w:color w:val="000000"/>
+          <w:sz w:val="19"/>
+        </w:rPr>
+        <w:t>Awarded 2026</w:t>
+      </w:r>
+    </w:p>
+    <w:p>
+      <w:pPr>
+        <w:tabs>
+          <w:tab w:pos="10800" w:val="right"/>
+        </w:tabs>
+        <w:spacing w:before="0" w:after="20"/>
+      </w:pPr>
+      <w:r>
+        <w:rPr>
+          <w:rFonts w:ascii="Times New Roman" w:hAnsi="Times New Roman"/>
+          <w:i/>
+          <w:color w:val="000000"/>
           <w:sz w:val="18"/>
         </w:rPr>
-        <w:t>UK Work Culture Programme (Awarded Participant)  |  Newcastle University</w:t>
+        <w:t>Newcastle University</w:t>
       </w:r>
       <w:r>
         <w:tab/>
@@ -1032,7 +1318,7 @@
           <w:color w:val="000000"/>
           <w:sz w:val="18"/>
         </w:rPr>
-        <w:t>Awarded 2026</w:t>
+        <w:t>Professional Development Programme</w:t>
       </w:r>
     </w:p>
     <w:p>
@@ -1063,9 +1349,67 @@
           <w:rFonts w:ascii="Times New Roman" w:hAnsi="Times New Roman"/>
           <w:b/>
           <w:color w:val="000000"/>
-          <w:sz w:val="20"/>
+          <w:sz w:val="21"/>
         </w:rPr>
-        <w:t>LEADERSHIP &amp; VOLUNTEERING</w:t>
+        <w:t>Additional Experience &amp; Recognition</w:t>
+      </w:r>
+    </w:p>
+    <w:p>
+      <w:pPr>
+        <w:tabs>
+          <w:tab w:pos="10800" w:val="right"/>
+        </w:tabs>
+        <w:spacing w:before="80" w:after="0"/>
+      </w:pPr>
+      <w:r>
+        <w:rPr>
+          <w:rFonts w:ascii="Times New Roman" w:hAnsi="Times New Roman"/>
+          <w:b/>
+          <w:color w:val="000000"/>
+          <w:sz w:val="19"/>
+        </w:rPr>
+        <w:t>Global Ambassador</w:t>
+      </w:r>
+      <w:r>
+        <w:tab/>
+      </w:r>
+      <w:r>
+        <w:rPr>
+          <w:rFonts w:ascii="Times New Roman" w:hAnsi="Times New Roman"/>
+          <w:i w:val="0"/>
+          <w:color w:val="000000"/>
+          <w:sz w:val="19"/>
+        </w:rPr>
+        <w:t>05/2023 – Present</w:t>
+      </w:r>
+    </w:p>
+    <w:p>
+      <w:pPr>
+        <w:tabs>
+          <w:tab w:pos="10800" w:val="right"/>
+        </w:tabs>
+        <w:spacing w:before="0" w:after="20"/>
+      </w:pPr>
+      <w:r>
+        <w:rPr>
+          <w:rFonts w:ascii="Times New Roman" w:hAnsi="Times New Roman"/>
+          <w:i/>
+          <w:color w:val="000000"/>
+          <w:sz w:val="18"/>
+        </w:rPr>
+        <w:t>WomenTech Network</w:t>
+      </w:r>
+      <w:r>
+        <w:tab/>
+      </w:r>
+      <w:r>
+        <w:rPr>
+          <w:rFonts w:ascii="Times New Roman" w:hAnsi="Times New Roman"/>
+          <w:i/>
+          <w:color w:val="000000"/>
+          <w:sz w:val="18"/>
+        </w:rPr>
+        <w:t>Volunteering Leadership Role</w:t>
       </w:r>
     </w:p>
     <w:p>
@@ -1081,24 +1425,65 @@
           <w:color w:val="000000"/>
           <w:sz w:val="18"/>
         </w:rPr>
+        <w:t>Active participant in global initiatives promoting technical excellence, leadership, and diversity in AI and Data Science.</w:t>
       </w:r>
+    </w:p>
+    <w:p>
+      <w:pPr>
+        <w:tabs>
+          <w:tab w:pos="10800" w:val="right"/>
+        </w:tabs>
+        <w:spacing w:before="80" w:after="0"/>
+      </w:pPr>
       <w:r>
         <w:rPr>
           <w:rFonts w:ascii="Times New Roman" w:hAnsi="Times New Roman"/>
           <w:b/>
           <w:color w:val="000000"/>
-          <w:sz w:val="18"/>
+          <w:sz w:val="19"/>
         </w:rPr>
-        <w:t>Global Ambassador | WomenTech Network</w:t>
+        <w:t>Volunteer Module Representative</w:t>
+      </w:r>
+      <w:r>
+        <w:tab/>
       </w:r>
       <w:r>
         <w:rPr>
           <w:rFonts w:ascii="Times New Roman" w:hAnsi="Times New Roman"/>
-          <w:b w:val="0"/>
+          <w:i w:val="0"/>
+          <w:color w:val="000000"/>
+          <w:sz w:val="19"/>
+        </w:rPr>
+        <w:t>01/2026 – Present</w:t>
+      </w:r>
+    </w:p>
+    <w:p>
+      <w:pPr>
+        <w:tabs>
+          <w:tab w:pos="10800" w:val="right"/>
+        </w:tabs>
+        <w:spacing w:before="0" w:after="20"/>
+      </w:pPr>
+      <w:r>
+        <w:rPr>
+          <w:rFonts w:ascii="Times New Roman" w:hAnsi="Times New Roman"/>
+          <w:i/>
           <w:color w:val="000000"/>
           <w:sz w:val="18"/>
         </w:rPr>
-        <w:t>: Active participant in global initiatives promoting technical excellence, leadership, and diversity in AI and Data Science.</w:t>
+        <w:t>Newcastle University</w:t>
+      </w:r>
+      <w:r>
+        <w:tab/>
+      </w:r>
+      <w:r>
+        <w:rPr>
+          <w:rFonts w:ascii="Times New Roman" w:hAnsi="Times New Roman"/>
+          <w:i/>
+          <w:color w:val="000000"/>
+          <w:sz w:val="18"/>
+        </w:rPr>
+        <w:t>Elected Student Leadership Role</w:t>
       </w:r>
     </w:p>
     <w:p>
@@ -1114,24 +1499,7 @@
           <w:color w:val="000000"/>
           <w:sz w:val="18"/>
         </w:rPr>
-      </w:r>
-      <w:r>
-        <w:rPr>
-          <w:rFonts w:ascii="Times New Roman" w:hAnsi="Times New Roman"/>
-          <w:b/>
-          <w:color w:val="000000"/>
-          <w:sz w:val="18"/>
-        </w:rPr>
-        <w:t>Volunteer Module Representative | Newcastle University</w:t>
-      </w:r>
-      <w:r>
-        <w:rPr>
-          <w:rFonts w:ascii="Times New Roman" w:hAnsi="Times New Roman"/>
-          <w:b w:val="0"/>
-          <w:color w:val="000000"/>
-          <w:sz w:val="18"/>
-        </w:rPr>
-        <w:t>: Elected to represent the MSc cohort, dedicating time to collaborate directly with faculty to optimize curriculum delivery and the student experience.</w:t>
+        <w:t>Elected to represent the MSc cohort, dedicating time to collaborate directly with faculty to optimize curriculum delivery and the student experience.</w:t>
       </w:r>
     </w:p>
     <w:sectPr>

</xml_diff>

<commit_message>
Update Devika Yanamala CV with light grey divider borders
</commit_message>
<xml_diff>
--- a/Devika_Yanamala_CV.docx
+++ b/Devika_Yanamala_CV.docx
@@ -65,7 +65,7 @@
       <w:pPr>
         <w:spacing w:before="200" w:after="40"/>
         <w:pBdr>
-          <w:bottom w:val="single" w:sz="6" w:space="2" w:color="000000"/>
+          <w:bottom w:val="single" w:sz="4" w:space="2" w:color="7F7F7F"/>
         </w:pBdr>
       </w:pPr>
       <w:r>
@@ -97,7 +97,7 @@
       <w:pPr>
         <w:spacing w:before="200" w:after="40"/>
         <w:pBdr>
-          <w:bottom w:val="single" w:sz="6" w:space="2" w:color="000000"/>
+          <w:bottom w:val="single" w:sz="4" w:space="2" w:color="7F7F7F"/>
         </w:pBdr>
       </w:pPr>
       <w:r>
@@ -246,7 +246,7 @@
       <w:pPr>
         <w:spacing w:before="200" w:after="40"/>
         <w:pBdr>
-          <w:bottom w:val="single" w:sz="6" w:space="2" w:color="000000"/>
+          <w:bottom w:val="single" w:sz="4" w:space="2" w:color="7F7F7F"/>
         </w:pBdr>
       </w:pPr>
       <w:r>
@@ -777,7 +777,7 @@
       <w:pPr>
         <w:spacing w:before="200" w:after="40"/>
         <w:pBdr>
-          <w:bottom w:val="single" w:sz="6" w:space="2" w:color="000000"/>
+          <w:bottom w:val="single" w:sz="4" w:space="2" w:color="7F7F7F"/>
         </w:pBdr>
       </w:pPr>
       <w:r>
@@ -1085,7 +1085,7 @@
       <w:pPr>
         <w:spacing w:before="200" w:after="40"/>
         <w:pBdr>
-          <w:bottom w:val="single" w:sz="6" w:space="2" w:color="000000"/>
+          <w:bottom w:val="single" w:sz="4" w:space="2" w:color="7F7F7F"/>
         </w:pBdr>
       </w:pPr>
       <w:r>
@@ -1250,7 +1250,7 @@
       <w:pPr>
         <w:spacing w:before="200" w:after="40"/>
         <w:pBdr>
-          <w:bottom w:val="single" w:sz="6" w:space="2" w:color="000000"/>
+          <w:bottom w:val="single" w:sz="4" w:space="2" w:color="7F7F7F"/>
         </w:pBdr>
       </w:pPr>
       <w:r>
@@ -1341,7 +1341,7 @@
       <w:pPr>
         <w:spacing w:before="200" w:after="40"/>
         <w:pBdr>
-          <w:bottom w:val="single" w:sz="6" w:space="2" w:color="000000"/>
+          <w:bottom w:val="single" w:sz="4" w:space="2" w:color="7F7F7F"/>
         </w:pBdr>
       </w:pPr>
       <w:r>

</xml_diff>

<commit_message>
Update Devika Yanamala CV with MSc dissertation details
</commit_message>
<xml_diff>
--- a/Devika_Yanamala_CV.docx
+++ b/Devika_Yanamala_CV.docx
@@ -1169,7 +1169,57 @@
           <w:color w:val="000000"/>
           <w:sz w:val="18"/>
         </w:rPr>
-        <w:t>UK Coursework: Data Visualisation, Machine Learning, Statistical Foundations of Data Science, Deep Learning, Image Processing, Generative AI for Business, Advanced AI, Group Project.</w:t>
+      </w:r>
+      <w:r>
+        <w:rPr>
+          <w:rFonts w:ascii="Times New Roman" w:hAnsi="Times New Roman"/>
+          <w:b/>
+          <w:color w:val="000000"/>
+          <w:sz w:val="18"/>
+        </w:rPr>
+        <w:t>UK Coursework</w:t>
+      </w:r>
+      <w:r>
+        <w:rPr>
+          <w:rFonts w:ascii="Times New Roman" w:hAnsi="Times New Roman"/>
+          <w:b w:val="0"/>
+          <w:color w:val="000000"/>
+          <w:sz w:val="18"/>
+        </w:rPr>
+        <w:t>: Data Visualisation, Machine Learning, Statistical Foundations of Data Science, Deep Learning, Image Processing, Generative AI for Business, Advanced AI, Group Project.</w:t>
+      </w:r>
+    </w:p>
+    <w:p>
+      <w:pPr>
+        <w:pStyle w:val="ListBullet"/>
+        <w:spacing w:before="0" w:after="30"/>
+        <w:ind w:left="288"/>
+      </w:pPr>
+      <w:r>
+        <w:rPr>
+          <w:rFonts w:ascii="Times New Roman" w:hAnsi="Times New Roman"/>
+          <w:b w:val="0"/>
+          <w:color w:val="000000"/>
+          <w:sz w:val="18"/>
+        </w:rPr>
+      </w:r>
+      <w:r>
+        <w:rPr>
+          <w:rFonts w:ascii="Times New Roman" w:hAnsi="Times New Roman"/>
+          <w:b/>
+          <w:color w:val="000000"/>
+          <w:sz w:val="18"/>
+        </w:rPr>
+        <w:t>Dissertation</w:t>
+      </w:r>
+      <w:r>
+        <w:rPr>
+          <w:rFonts w:ascii="Times New Roman" w:hAnsi="Times New Roman"/>
+          <w:b w:val="0"/>
+          <w:color w:val="000000"/>
+          <w:sz w:val="18"/>
+        </w:rPr>
+        <w:t>: Towards the Modelling of Traffic Flows from Open-Source Data – An Assessment of Automated OSM Topological Verification for Machine Learning-Based AADT Prediction. Developing a python pipeline (OSMnx, NetworkX) to resolve topological errors and engineer graph-theoretic centrality features to improve Random Forest and XGBoost traffic prediction models.</w:t>
       </w:r>
     </w:p>
     <w:p>

</xml_diff>

<commit_message>
Remove BTech relevant coursework bullet point
</commit_message>
<xml_diff>
--- a/Devika_Yanamala_CV.docx
+++ b/Devika_Yanamala_CV.docx
@@ -1282,22 +1282,6 @@
     </w:p>
     <w:p>
       <w:pPr>
-        <w:pStyle w:val="ListBullet"/>
-        <w:spacing w:before="0" w:after="30"/>
-        <w:ind w:left="288"/>
-      </w:pPr>
-      <w:r>
-        <w:rPr>
-          <w:rFonts w:ascii="Times New Roman" w:hAnsi="Times New Roman"/>
-          <w:b w:val="0"/>
-          <w:color w:val="000000"/>
-          <w:sz w:val="18"/>
-        </w:rPr>
-        <w:t>Relevant Coursework: Data Structures, Algorithms, Database Management Systems, Machine Learning Foundations.</w:t>
-      </w:r>
-    </w:p>
-    <w:p>
-      <w:pPr>
         <w:spacing w:before="200" w:after="40"/>
         <w:pBdr>
           <w:bottom w:val="single" w:sz="4" w:space="2" w:color="7F7F7F"/>

</xml_diff>

<commit_message>
Upgrade Technical Expertise skills section classification
</commit_message>
<xml_diff>
--- a/Devika_Yanamala_CV.docx
+++ b/Devika_Yanamala_CV.docx
@@ -131,7 +131,7 @@
           <w:color w:val="000000"/>
           <w:sz w:val="18"/>
         </w:rPr>
-        <w:t>Analytics &amp; Tools</w:t>
+        <w:t>Programming Languages &amp; Databases</w:t>
       </w:r>
       <w:r>
         <w:rPr>
@@ -140,7 +140,7 @@
           <w:color w:val="000000"/>
           <w:sz w:val="18"/>
         </w:rPr>
-        <w:t>: Excel (XLOOKUP, PivotTables, Power Query), Power BI (DAX, Star Schema, interactive dashboards), KPI Reporting &amp; Dashboards, Tableau, Matplotlib, Seaborn, Exploratory Data Analysis (EDA).</w:t>
+        <w:t>: Python, SQL (PostgreSQL, Snowflake, MySQL, SQLite), R.</w:t>
       </w:r>
     </w:p>
     <w:p>
@@ -164,7 +164,7 @@
           <w:color w:val="000000"/>
           <w:sz w:val="18"/>
         </w:rPr>
-        <w:t>Data &amp; Automation</w:t>
+        <w:t>Machine Learning &amp; AI</w:t>
       </w:r>
       <w:r>
         <w:rPr>
@@ -173,7 +173,7 @@
           <w:color w:val="000000"/>
           <w:sz w:val="18"/>
         </w:rPr>
-        <w:t>: SQL (PostgreSQL, Snowflake), Python, ETL Data Pipelines, Data Validation &amp; Auditing, exposure to enterprise data systems and SAP-based workflows.</w:t>
+        <w:t>: Supervised &amp; Unsupervised Learning (Classification, Regression, Clustering), XGBoost, Scikit-Learn, SHAP (Explainable AI), NLP (spaCy, NLTK), LLM/Generative AI APIs (GPT-4, Gemini), Prompt Engineering.</w:t>
       </w:r>
     </w:p>
     <w:p>
@@ -197,7 +197,7 @@
           <w:color w:val="000000"/>
           <w:sz w:val="18"/>
         </w:rPr>
-        <w:t>Operations Analytics</w:t>
+        <w:t>Data Engineering &amp; Big Data</w:t>
       </w:r>
       <w:r>
         <w:rPr>
@@ -206,7 +206,7 @@
           <w:color w:val="000000"/>
           <w:sz w:val="18"/>
         </w:rPr>
-        <w:t>: Capacity &amp; Resource Planning, Production Scheduling, Inventory Tracking, Data Collection, Bottleneck Identification, operational efficiency metrics.</w:t>
+        <w:t>: ETL/ELT Pipelines, PySpark, Apache Kafka, Apache Spark, Data Warehousing, Data Validation &amp; Auditing, API Integrations.</w:t>
       </w:r>
     </w:p>
     <w:p>
@@ -230,7 +230,7 @@
           <w:color w:val="000000"/>
           <w:sz w:val="18"/>
         </w:rPr>
-        <w:t>AI &amp; Data Science</w:t>
+        <w:t>Cloud &amp; Infrastructure</w:t>
       </w:r>
       <w:r>
         <w:rPr>
@@ -239,7 +239,73 @@
           <w:color w:val="000000"/>
           <w:sz w:val="18"/>
         </w:rPr>
-        <w:t>: Machine Learning (classification, regression, clustering), Predictive Modeling, XGBoost, Scikit-Learn, NLP (basic), exposure to generative AI/LLM tools and workflows, Statistical Analysis (hypothesis testing, time series, A/B testing).</w:t>
+        <w:t>: AWS (EC2, S3, Lambda), Git, Version Control, Docker (exposure).</w:t>
+      </w:r>
+    </w:p>
+    <w:p>
+      <w:pPr>
+        <w:pStyle w:val="ListBullet"/>
+        <w:spacing w:before="0" w:after="30"/>
+        <w:ind w:left="288"/>
+      </w:pPr>
+      <w:r>
+        <w:rPr>
+          <w:rFonts w:ascii="Times New Roman" w:hAnsi="Times New Roman"/>
+          <w:b w:val="0"/>
+          <w:color w:val="000000"/>
+          <w:sz w:val="18"/>
+        </w:rPr>
+      </w:r>
+      <w:r>
+        <w:rPr>
+          <w:rFonts w:ascii="Times New Roman" w:hAnsi="Times New Roman"/>
+          <w:b/>
+          <w:color w:val="000000"/>
+          <w:sz w:val="18"/>
+        </w:rPr>
+        <w:t>Business Intelligence &amp; Analytics</w:t>
+      </w:r>
+      <w:r>
+        <w:rPr>
+          <w:rFonts w:ascii="Times New Roman" w:hAnsi="Times New Roman"/>
+          <w:b w:val="0"/>
+          <w:color w:val="000000"/>
+          <w:sz w:val="18"/>
+        </w:rPr>
+        <w:t>: Power BI (Advanced DAX, Star Schema modeling, interactive dashboards), Excel (XLOOKUP, PivotTables, Power Query), Tableau, Matplotlib, Seaborn, Exploratory Data Analysis (EDA).</w:t>
+      </w:r>
+    </w:p>
+    <w:p>
+      <w:pPr>
+        <w:pStyle w:val="ListBullet"/>
+        <w:spacing w:before="0" w:after="30"/>
+        <w:ind w:left="288"/>
+      </w:pPr>
+      <w:r>
+        <w:rPr>
+          <w:rFonts w:ascii="Times New Roman" w:hAnsi="Times New Roman"/>
+          <w:b w:val="0"/>
+          <w:color w:val="000000"/>
+          <w:sz w:val="18"/>
+        </w:rPr>
+      </w:r>
+      <w:r>
+        <w:rPr>
+          <w:rFonts w:ascii="Times New Roman" w:hAnsi="Times New Roman"/>
+          <w:b/>
+          <w:color w:val="000000"/>
+          <w:sz w:val="18"/>
+        </w:rPr>
+        <w:t>Operations &amp; Systems Analytics</w:t>
+      </w:r>
+      <w:r>
+        <w:rPr>
+          <w:rFonts w:ascii="Times New Roman" w:hAnsi="Times New Roman"/>
+          <w:b w:val="0"/>
+          <w:color w:val="000000"/>
+          <w:sz w:val="18"/>
+        </w:rPr>
+        <w:t>: Capacity &amp; Resource Planning, Production Scheduling, Inventory Tracking, Bottleneck Identification, Operational Efficiency Metrics.</w:t>
       </w:r>
     </w:p>
     <w:p>

</xml_diff>

<commit_message>
Remove Studentship and update Part-Time Role to Part-Time
</commit_message>
<xml_diff>
--- a/Devika_Yanamala_CV.docx
+++ b/Devika_Yanamala_CV.docx
@@ -551,7 +551,7 @@
           <w:color w:val="000000"/>
           <w:sz w:val="19"/>
         </w:rPr>
-        <w:t>Data Analyst (Studentship)</w:t>
+        <w:t>Data Analyst</w:t>
       </w:r>
       <w:r>
         <w:tab/>
@@ -592,7 +592,7 @@
           <w:color w:val="000000"/>
           <w:sz w:val="18"/>
         </w:rPr>
-        <w:t>Part-Time Role - Newcastle upon Tyne, UK</w:t>
+        <w:t>Part-Time - Newcastle upon Tyne, UK</w:t>
       </w:r>
     </w:p>
     <w:p>

</xml_diff>

<commit_message>
Remove Global Industry Project from Experience timeline and resume
</commit_message>
<xml_diff>
--- a/Devika_Yanamala_CV.docx
+++ b/Devika_Yanamala_CV.docx
@@ -323,112 +323,6 @@
           <w:sz w:val="21"/>
         </w:rPr>
         <w:t>Professional Experience</w:t>
-      </w:r>
-    </w:p>
-    <w:p>
-      <w:pPr>
-        <w:tabs>
-          <w:tab w:pos="10800" w:val="right"/>
-        </w:tabs>
-        <w:spacing w:before="80" w:after="0"/>
-      </w:pPr>
-      <w:r>
-        <w:rPr>
-          <w:rFonts w:ascii="Times New Roman" w:hAnsi="Times New Roman"/>
-          <w:b/>
-          <w:color w:val="000000"/>
-          <w:sz w:val="19"/>
-        </w:rPr>
-        <w:t>Global Industry Project – Industry Consulting Experience</w:t>
-      </w:r>
-      <w:r>
-        <w:tab/>
-      </w:r>
-      <w:r>
-        <w:rPr>
-          <w:rFonts w:ascii="Times New Roman" w:hAnsi="Times New Roman"/>
-          <w:i w:val="0"/>
-          <w:color w:val="000000"/>
-          <w:sz w:val="19"/>
-        </w:rPr>
-        <w:t>June 2026 – July 2026</w:t>
-      </w:r>
-    </w:p>
-    <w:p>
-      <w:pPr>
-        <w:tabs>
-          <w:tab w:pos="10800" w:val="right"/>
-        </w:tabs>
-        <w:spacing w:before="0" w:after="20"/>
-      </w:pPr>
-      <w:r>
-        <w:rPr>
-          <w:rFonts w:ascii="Times New Roman" w:hAnsi="Times New Roman"/>
-          <w:i/>
-          <w:color w:val="000000"/>
-          <w:sz w:val="18"/>
-        </w:rPr>
-        <w:t>Newcastle University</w:t>
-      </w:r>
-      <w:r>
-        <w:tab/>
-      </w:r>
-      <w:r>
-        <w:rPr>
-          <w:rFonts w:ascii="Times New Roman" w:hAnsi="Times New Roman"/>
-          <w:i/>
-          <w:color w:val="000000"/>
-          <w:sz w:val="18"/>
-        </w:rPr>
-        <w:t>Industry Partner Project - Newcastle, UK</w:t>
-      </w:r>
-    </w:p>
-    <w:p>
-      <w:pPr>
-        <w:pStyle w:val="ListBullet"/>
-        <w:spacing w:before="0" w:after="30"/>
-        <w:ind w:left="288"/>
-      </w:pPr>
-      <w:r>
-        <w:rPr>
-          <w:rFonts w:ascii="Times New Roman" w:hAnsi="Times New Roman"/>
-          <w:b w:val="0"/>
-          <w:color w:val="000000"/>
-          <w:sz w:val="18"/>
-        </w:rPr>
-        <w:t>Selected for a competitive, high-impact industry consulting program solving complex operational challenges for a UK industry partner.</w:t>
-      </w:r>
-    </w:p>
-    <w:p>
-      <w:pPr>
-        <w:pStyle w:val="ListBullet"/>
-        <w:spacing w:before="0" w:after="30"/>
-        <w:ind w:left="288"/>
-      </w:pPr>
-      <w:r>
-        <w:rPr>
-          <w:rFonts w:ascii="Times New Roman" w:hAnsi="Times New Roman"/>
-          <w:b w:val="0"/>
-          <w:color w:val="000000"/>
-          <w:sz w:val="18"/>
-        </w:rPr>
-        <w:t>Collaborated in a team of data scientists to interrogate and analyze historical operational data, identifying critical process bottlenecks.</w:t>
-      </w:r>
-    </w:p>
-    <w:p>
-      <w:pPr>
-        <w:pStyle w:val="ListBullet"/>
-        <w:spacing w:before="0" w:after="30"/>
-        <w:ind w:left="288"/>
-      </w:pPr>
-      <w:r>
-        <w:rPr>
-          <w:rFonts w:ascii="Times New Roman" w:hAnsi="Times New Roman"/>
-          <w:b w:val="0"/>
-          <w:color w:val="000000"/>
-          <w:sz w:val="18"/>
-        </w:rPr>
-        <w:t>Presented findings and recommendations to stakeholders, focusing on problem-solving and business impact.</w:t>
       </w:r>
     </w:p>
     <w:p>

</xml_diff>

<commit_message>
Revert "Remove Global Industry Project from Experience timeline and resume"
This reverts commit 2c7ae843c4d78d0882029e70a9ae7581a8677c2a.
</commit_message>
<xml_diff>
--- a/Devika_Yanamala_CV.docx
+++ b/Devika_Yanamala_CV.docx
@@ -323,6 +323,112 @@
           <w:sz w:val="21"/>
         </w:rPr>
         <w:t>Professional Experience</w:t>
+      </w:r>
+    </w:p>
+    <w:p>
+      <w:pPr>
+        <w:tabs>
+          <w:tab w:pos="10800" w:val="right"/>
+        </w:tabs>
+        <w:spacing w:before="80" w:after="0"/>
+      </w:pPr>
+      <w:r>
+        <w:rPr>
+          <w:rFonts w:ascii="Times New Roman" w:hAnsi="Times New Roman"/>
+          <w:b/>
+          <w:color w:val="000000"/>
+          <w:sz w:val="19"/>
+        </w:rPr>
+        <w:t>Global Industry Project – Industry Consulting Experience</w:t>
+      </w:r>
+      <w:r>
+        <w:tab/>
+      </w:r>
+      <w:r>
+        <w:rPr>
+          <w:rFonts w:ascii="Times New Roman" w:hAnsi="Times New Roman"/>
+          <w:i w:val="0"/>
+          <w:color w:val="000000"/>
+          <w:sz w:val="19"/>
+        </w:rPr>
+        <w:t>June 2026 – July 2026</w:t>
+      </w:r>
+    </w:p>
+    <w:p>
+      <w:pPr>
+        <w:tabs>
+          <w:tab w:pos="10800" w:val="right"/>
+        </w:tabs>
+        <w:spacing w:before="0" w:after="20"/>
+      </w:pPr>
+      <w:r>
+        <w:rPr>
+          <w:rFonts w:ascii="Times New Roman" w:hAnsi="Times New Roman"/>
+          <w:i/>
+          <w:color w:val="000000"/>
+          <w:sz w:val="18"/>
+        </w:rPr>
+        <w:t>Newcastle University</w:t>
+      </w:r>
+      <w:r>
+        <w:tab/>
+      </w:r>
+      <w:r>
+        <w:rPr>
+          <w:rFonts w:ascii="Times New Roman" w:hAnsi="Times New Roman"/>
+          <w:i/>
+          <w:color w:val="000000"/>
+          <w:sz w:val="18"/>
+        </w:rPr>
+        <w:t>Industry Partner Project - Newcastle, UK</w:t>
+      </w:r>
+    </w:p>
+    <w:p>
+      <w:pPr>
+        <w:pStyle w:val="ListBullet"/>
+        <w:spacing w:before="0" w:after="30"/>
+        <w:ind w:left="288"/>
+      </w:pPr>
+      <w:r>
+        <w:rPr>
+          <w:rFonts w:ascii="Times New Roman" w:hAnsi="Times New Roman"/>
+          <w:b w:val="0"/>
+          <w:color w:val="000000"/>
+          <w:sz w:val="18"/>
+        </w:rPr>
+        <w:t>Selected for a competitive, high-impact industry consulting program solving complex operational challenges for a UK industry partner.</w:t>
+      </w:r>
+    </w:p>
+    <w:p>
+      <w:pPr>
+        <w:pStyle w:val="ListBullet"/>
+        <w:spacing w:before="0" w:after="30"/>
+        <w:ind w:left="288"/>
+      </w:pPr>
+      <w:r>
+        <w:rPr>
+          <w:rFonts w:ascii="Times New Roman" w:hAnsi="Times New Roman"/>
+          <w:b w:val="0"/>
+          <w:color w:val="000000"/>
+          <w:sz w:val="18"/>
+        </w:rPr>
+        <w:t>Collaborated in a team of data scientists to interrogate and analyze historical operational data, identifying critical process bottlenecks.</w:t>
+      </w:r>
+    </w:p>
+    <w:p>
+      <w:pPr>
+        <w:pStyle w:val="ListBullet"/>
+        <w:spacing w:before="0" w:after="30"/>
+        <w:ind w:left="288"/>
+      </w:pPr>
+      <w:r>
+        <w:rPr>
+          <w:rFonts w:ascii="Times New Roman" w:hAnsi="Times New Roman"/>
+          <w:b w:val="0"/>
+          <w:color w:val="000000"/>
+          <w:sz w:val="18"/>
+        </w:rPr>
+        <w:t>Presented findings and recommendations to stakeholders, focusing on problem-solving and business impact.</w:t>
       </w:r>
     </w:p>
     <w:p>

</xml_diff>